<commit_message>
C2C resume: expand experience bullets for all clients from established experience.
Made-with: Cursor
</commit_message>
<xml_diff>
--- a/public/resume-c2c.docx
+++ b/public/resume-c2c.docx
@@ -204,20 +204,33 @@
           <w:sz w:val="22"/>
           <w:szCs w:val="22"/>
         </w:rPr>
-        <w:t xml:space="preserve">• Migrated legacy Spring MVC to Java 17 / Spring Boot microservices; modular architecture; reduced production incidents by 40%.</w:t>
-      </w:r>
-    </w:p>
-    <w:p>
-      <w:pPr>
-        <w:spacing w:after="20"/>
-      </w:pPr>
-      <w:r>
-        <w:rPr>
-          <w:rFonts w:ascii="Times New Roman" w:cs="Times New Roman" w:eastAsia="Times New Roman" w:hAnsi="Times New Roman"/>
-          <w:sz w:val="22"/>
-          <w:szCs w:val="22"/>
-        </w:rPr>
-        <w:t xml:space="preserve">• Event-driven stack: Redis, RabbitMQ, Kafka; 10K+ transactions daily, 99.9% uptime; retry and circuit breaker patterns.</w:t>
+        <w:t xml:space="preserve">• Migrated legacy Spring MVC to Java 17 / Spring Boot microservices; owned technical design through deployment; modular boundaries for scalability; reduced production incidents by 40%.</w:t>
+      </w:r>
+    </w:p>
+    <w:p>
+      <w:pPr>
+        <w:spacing w:after="20"/>
+      </w:pPr>
+      <w:r>
+        <w:rPr>
+          <w:rFonts w:ascii="Times New Roman" w:cs="Times New Roman" w:eastAsia="Times New Roman" w:hAnsi="Times New Roman"/>
+          <w:sz w:val="22"/>
+          <w:szCs w:val="22"/>
+        </w:rPr>
+        <w:t xml:space="preserve">• Designed microservices for high availability, maintainability, and performance across enterprise applications.</w:t>
+      </w:r>
+    </w:p>
+    <w:p>
+      <w:pPr>
+        <w:spacing w:after="20"/>
+      </w:pPr>
+      <w:r>
+        <w:rPr>
+          <w:rFonts w:ascii="Times New Roman" w:cs="Times New Roman" w:eastAsia="Times New Roman" w:hAnsi="Times New Roman"/>
+          <w:sz w:val="22"/>
+          <w:szCs w:val="22"/>
+        </w:rPr>
+        <w:t xml:space="preserve">• Event-driven stack: Redis, RabbitMQ, Kafka; 10K+ transactions daily, 99.9% uptime; retry and circuit breaker patterns for resilient integrations.</w:t>
       </w:r>
     </w:p>
     <w:p>
@@ -243,7 +256,7 @@
           <w:sz w:val="22"/>
           <w:szCs w:val="22"/>
         </w:rPr>
-        <w:t xml:space="preserve">• Frontend: Angular and React integrated with Spring Security and OAuth2-secured APIs (JSON/HTTP).</w:t>
+        <w:t xml:space="preserve">• Frontend: Angular and React integrated with Spring Security and OAuth2-secured APIs (JSON/HTTP); responsive enterprise UIs.</w:t>
       </w:r>
     </w:p>
     <w:p>
@@ -269,7 +282,20 @@
           <w:sz w:val="22"/>
           <w:szCs w:val="22"/>
         </w:rPr>
-        <w:t xml:space="preserve">• Observability: Prometheus and Grafana for API latency, errors, and capacity signals.</w:t>
+        <w:t xml:space="preserve">• CI/CD with Jenkins and Bitbucket: standardized build, scan, and deploy stages for repeatable releases to cloud environments.</w:t>
+      </w:r>
+    </w:p>
+    <w:p>
+      <w:pPr>
+        <w:spacing w:after="20"/>
+      </w:pPr>
+      <w:r>
+        <w:rPr>
+          <w:rFonts w:ascii="Times New Roman" w:cs="Times New Roman" w:eastAsia="Times New Roman" w:hAnsi="Times New Roman"/>
+          <w:sz w:val="22"/>
+          <w:szCs w:val="22"/>
+        </w:rPr>
+        <w:t xml:space="preserve">• Observability: Prometheus and Grafana for API latency, errors, and capacity signals aligned to operational KPIs.</w:t>
       </w:r>
     </w:p>
     <w:p>
@@ -282,7 +308,7 @@
           <w:sz w:val="22"/>
           <w:szCs w:val="22"/>
         </w:rPr>
-        <w:t xml:space="preserve">• Quality: JUnit and Mockito for regression and API contract coverage across environments.</w:t>
+        <w:t xml:space="preserve">• Quality: JUnit and Mockito for regression and service-level tests; release gates tied to coverage and defect trends.</w:t>
       </w:r>
     </w:p>
     <w:p>
@@ -323,59 +349,111 @@
           <w:sz w:val="22"/>
           <w:szCs w:val="22"/>
         </w:rPr>
-        <w:t xml:space="preserve">• Financial services: Java / Spring Boot for retirement, life insurance, and asset management; Hibernate-backed REST APIs for customer and agent portals.</w:t>
-      </w:r>
-    </w:p>
-    <w:p>
-      <w:pPr>
-        <w:spacing w:after="20"/>
-      </w:pPr>
-      <w:r>
-        <w:rPr>
-          <w:rFonts w:ascii="Times New Roman" w:cs="Times New Roman" w:eastAsia="Times New Roman" w:hAnsi="Times New Roman"/>
-          <w:sz w:val="22"/>
-          <w:szCs w:val="22"/>
-        </w:rPr>
-        <w:t xml:space="preserve">• Frontend: Angular and React with HTML5, CSS3, and Bootstrap; validation reduced data errors by 90%.</w:t>
-      </w:r>
-    </w:p>
-    <w:p>
-      <w:pPr>
-        <w:spacing w:after="20"/>
-      </w:pPr>
-      <w:r>
-        <w:rPr>
-          <w:rFonts w:ascii="Times New Roman" w:cs="Times New Roman" w:eastAsia="Times New Roman" w:hAnsi="Times New Roman"/>
-          <w:sz w:val="22"/>
-          <w:szCs w:val="22"/>
-        </w:rPr>
-        <w:t xml:space="preserve">• Backend performance: Spring Data JPA and PostgreSQL with pooling; ~200ms average API response time (25% improvement).</w:t>
-      </w:r>
-    </w:p>
-    <w:p>
-      <w:pPr>
-        <w:spacing w:after="20"/>
-      </w:pPr>
-      <w:r>
-        <w:rPr>
-          <w:rFonts w:ascii="Times New Roman" w:cs="Times New Roman" w:eastAsia="Times New Roman" w:hAnsi="Times New Roman"/>
-          <w:sz w:val="22"/>
-          <w:szCs w:val="22"/>
-        </w:rPr>
-        <w:t xml:space="preserve">• Security: OAuth2, JWT, Redis session caching for peak traffic.</w:t>
-      </w:r>
-    </w:p>
-    <w:p>
-      <w:pPr>
-        <w:spacing w:after="20"/>
-      </w:pPr>
-      <w:r>
-        <w:rPr>
-          <w:rFonts w:ascii="Times New Roman" w:cs="Times New Roman" w:eastAsia="Times New Roman" w:hAnsi="Times New Roman"/>
-          <w:sz w:val="22"/>
-          <w:szCs w:val="22"/>
-        </w:rPr>
-        <w:t xml:space="preserve">• Cloud: Docker, Kubernetes, AWS EC2, S3, RDS, Lambda with DevOps collaboration.</w:t>
+        <w:t xml:space="preserve">• Financial services: Java / Spring Boot for retirement, life insurance, and asset management; Hibernate-backed REST APIs for customer-facing and agent-facing portals and dashboards.</w:t>
+      </w:r>
+    </w:p>
+    <w:p>
+      <w:pPr>
+        <w:spacing w:after="20"/>
+      </w:pPr>
+      <w:r>
+        <w:rPr>
+          <w:rFonts w:ascii="Times New Roman" w:cs="Times New Roman" w:eastAsia="Times New Roman" w:hAnsi="Times New Roman"/>
+          <w:sz w:val="22"/>
+          <w:szCs w:val="22"/>
+        </w:rPr>
+        <w:t xml:space="preserve">• Frontend: Angular and React with HTML5, CSS3, and Bootstrap; client- and server-side validation; reduced data errors by 90%.</w:t>
+      </w:r>
+    </w:p>
+    <w:p>
+      <w:pPr>
+        <w:spacing w:after="20"/>
+      </w:pPr>
+      <w:r>
+        <w:rPr>
+          <w:rFonts w:ascii="Times New Roman" w:cs="Times New Roman" w:eastAsia="Times New Roman" w:hAnsi="Times New Roman"/>
+          <w:sz w:val="22"/>
+          <w:szCs w:val="22"/>
+        </w:rPr>
+        <w:t xml:space="preserve">• Backend performance: Spring Data JPA and PostgreSQL with connection pooling; improved API response time by 25% with reliable sub-200ms averages on key paths.</w:t>
+      </w:r>
+    </w:p>
+    <w:p>
+      <w:pPr>
+        <w:spacing w:after="20"/>
+      </w:pPr>
+      <w:r>
+        <w:rPr>
+          <w:rFonts w:ascii="Times New Roman" w:cs="Times New Roman" w:eastAsia="Times New Roman" w:hAnsi="Times New Roman"/>
+          <w:sz w:val="22"/>
+          <w:szCs w:val="22"/>
+        </w:rPr>
+        <w:t xml:space="preserve">• Security: OAuth2, JWT, and Redis for authentication, authorization, and session caching under peak traffic.</w:t>
+      </w:r>
+    </w:p>
+    <w:p>
+      <w:pPr>
+        <w:spacing w:after="20"/>
+      </w:pPr>
+      <w:r>
+        <w:rPr>
+          <w:rFonts w:ascii="Times New Roman" w:cs="Times New Roman" w:eastAsia="Times New Roman" w:hAnsi="Times New Roman"/>
+          <w:sz w:val="22"/>
+          <w:szCs w:val="22"/>
+        </w:rPr>
+        <w:t xml:space="preserve">• Secure coding with Spring Security: input validation and least-privilege access patterns for sensitive financial workflows.</w:t>
+      </w:r>
+    </w:p>
+    <w:p>
+      <w:pPr>
+        <w:spacing w:after="20"/>
+      </w:pPr>
+      <w:r>
+        <w:rPr>
+          <w:rFonts w:ascii="Times New Roman" w:cs="Times New Roman" w:eastAsia="Times New Roman" w:hAnsi="Times New Roman"/>
+          <w:sz w:val="22"/>
+          <w:szCs w:val="22"/>
+        </w:rPr>
+        <w:t xml:space="preserve">• Cloud: Docker, Kubernetes, AWS EC2, S3, RDS, Lambda; partnered with DevOps for release hygiene and environment parity.</w:t>
+      </w:r>
+    </w:p>
+    <w:p>
+      <w:pPr>
+        <w:spacing w:after="20"/>
+      </w:pPr>
+      <w:r>
+        <w:rPr>
+          <w:rFonts w:ascii="Times New Roman" w:cs="Times New Roman" w:eastAsia="Times New Roman" w:hAnsi="Times New Roman"/>
+          <w:sz w:val="22"/>
+          <w:szCs w:val="22"/>
+        </w:rPr>
+        <w:t xml:space="preserve">• Technical design: specifications and API contracts for policy, claims, and reporting; reviews with architecture and compliance stakeholders.</w:t>
+      </w:r>
+    </w:p>
+    <w:p>
+      <w:pPr>
+        <w:spacing w:after="20"/>
+      </w:pPr>
+      <w:r>
+        <w:rPr>
+          <w:rFonts w:ascii="Times New Roman" w:cs="Times New Roman" w:eastAsia="Times New Roman" w:hAnsi="Times New Roman"/>
+          <w:sz w:val="22"/>
+          <w:szCs w:val="22"/>
+        </w:rPr>
+        <w:t xml:space="preserve">• CI/CD improvements for predictable cloud deployments, fewer manual steps, and faster feedback from test through production.</w:t>
+      </w:r>
+    </w:p>
+    <w:p>
+      <w:pPr>
+        <w:spacing w:after="20"/>
+      </w:pPr>
+      <w:r>
+        <w:rPr>
+          <w:rFonts w:ascii="Times New Roman" w:cs="Times New Roman" w:eastAsia="Times New Roman" w:hAnsi="Times New Roman"/>
+          <w:sz w:val="22"/>
+          <w:szCs w:val="22"/>
+        </w:rPr>
+        <w:t xml:space="preserve">• Agile delivery with QA and Product: backlog refinement, acceptance criteria, demos; 8+ on-schedule features (policy management, claims, reporting).</w:t>
       </w:r>
     </w:p>
     <w:p>
@@ -388,7 +466,7 @@
           <w:sz w:val="22"/>
           <w:szCs w:val="22"/>
         </w:rPr>
-        <w:t xml:space="preserve">• Agile delivery with QA and Product: 8+ on-schedule features (policy management, claims, reporting).</w:t>
+        <w:t xml:space="preserve">• Quality: JUnit and Mockito for critical policy and claims paths to protect regressions in production.</w:t>
       </w:r>
     </w:p>
     <w:p>
@@ -429,33 +507,98 @@
           <w:sz w:val="22"/>
           <w:szCs w:val="22"/>
         </w:rPr>
-        <w:t xml:space="preserve">• Backend: Java 11, Spring Boot, Spring Data JPA, Hibernate for portfolio and asset tracking; 500+ users, 10K+ daily transactions.</w:t>
-      </w:r>
-    </w:p>
-    <w:p>
-      <w:pPr>
-        <w:spacing w:after="20"/>
-      </w:pPr>
-      <w:r>
-        <w:rPr>
-          <w:rFonts w:ascii="Times New Roman" w:cs="Times New Roman" w:eastAsia="Times New Roman" w:hAnsi="Times New Roman"/>
-          <w:sz w:val="22"/>
-          <w:szCs w:val="22"/>
-        </w:rPr>
-        <w:t xml:space="preserve">• Full stack: REST APIs with React UIs for field dashboards and asset portals; manual reporting time reduced by 50%.</w:t>
-      </w:r>
-    </w:p>
-    <w:p>
-      <w:pPr>
-        <w:spacing w:after="20"/>
-      </w:pPr>
-      <w:r>
-        <w:rPr>
-          <w:rFonts w:ascii="Times New Roman" w:cs="Times New Roman" w:eastAsia="Times New Roman" w:hAnsi="Times New Roman"/>
-          <w:sz w:val="22"/>
-          <w:szCs w:val="22"/>
-        </w:rPr>
-        <w:t xml:space="preserve">• Cloud &amp; CI/CD: Oracle and MySQL; Jenkins pipelines; Terraform for infrastructure as code; provisioning time reduced by 60%.</w:t>
+        <w:t xml:space="preserve">• Backend: Java 11, Spring Boot, Spring Data JPA, Hibernate for portfolio calculations and asset tracking; 500+ users, 10K+ daily transactions.</w:t>
+      </w:r>
+    </w:p>
+    <w:p>
+      <w:pPr>
+        <w:spacing w:after="20"/>
+      </w:pPr>
+      <w:r>
+        <w:rPr>
+          <w:rFonts w:ascii="Times New Roman" w:cs="Times New Roman" w:eastAsia="Times New Roman" w:hAnsi="Times New Roman"/>
+          <w:sz w:val="22"/>
+          <w:szCs w:val="22"/>
+        </w:rPr>
+        <w:t xml:space="preserve">• REST APIs enabling real-time exchange between React front end and Java services for operational dashboards.</w:t>
+      </w:r>
+    </w:p>
+    <w:p>
+      <w:pPr>
+        <w:spacing w:after="20"/>
+      </w:pPr>
+      <w:r>
+        <w:rPr>
+          <w:rFonts w:ascii="Times New Roman" w:cs="Times New Roman" w:eastAsia="Times New Roman" w:hAnsi="Times New Roman"/>
+          <w:sz w:val="22"/>
+          <w:szCs w:val="22"/>
+        </w:rPr>
+        <w:t xml:space="preserve">• Full stack: responsive React UIs (HTML5, CSS3) for field operation dashboards and asset performance portals; manual reporting time reduced by 50%.</w:t>
+      </w:r>
+    </w:p>
+    <w:p>
+      <w:pPr>
+        <w:spacing w:after="20"/>
+      </w:pPr>
+      <w:r>
+        <w:rPr>
+          <w:rFonts w:ascii="Times New Roman" w:cs="Times New Roman" w:eastAsia="Times New Roman" w:hAnsi="Times New Roman"/>
+          <w:sz w:val="22"/>
+          <w:szCs w:val="22"/>
+        </w:rPr>
+        <w:t xml:space="preserve">• Data layer: Oracle and MySQL integration; tuned SQL and persistence for reporting and transactional workloads.</w:t>
+      </w:r>
+    </w:p>
+    <w:p>
+      <w:pPr>
+        <w:spacing w:after="20"/>
+      </w:pPr>
+      <w:r>
+        <w:rPr>
+          <w:rFonts w:ascii="Times New Roman" w:cs="Times New Roman" w:eastAsia="Times New Roman" w:hAnsi="Times New Roman"/>
+          <w:sz w:val="22"/>
+          <w:szCs w:val="22"/>
+        </w:rPr>
+        <w:t xml:space="preserve">• CI/CD: Jenkins pipelines with automated build-test-deploy; Terraform and Ansible for infrastructure as code; provisioning time reduced by 60%.</w:t>
+      </w:r>
+    </w:p>
+    <w:p>
+      <w:pPr>
+        <w:spacing w:after="20"/>
+      </w:pPr>
+      <w:r>
+        <w:rPr>
+          <w:rFonts w:ascii="Times New Roman" w:cs="Times New Roman" w:eastAsia="Times New Roman" w:hAnsi="Times New Roman"/>
+          <w:sz w:val="22"/>
+          <w:szCs w:val="22"/>
+        </w:rPr>
+        <w:t xml:space="preserve">• Kubernetes: containerized services with health checks, readiness probes, and auto-scaling for variable load.</w:t>
+      </w:r>
+    </w:p>
+    <w:p>
+      <w:pPr>
+        <w:spacing w:after="20"/>
+      </w:pPr>
+      <w:r>
+        <w:rPr>
+          <w:rFonts w:ascii="Times New Roman" w:cs="Times New Roman" w:eastAsia="Times New Roman" w:hAnsi="Times New Roman"/>
+          <w:sz w:val="22"/>
+          <w:szCs w:val="22"/>
+        </w:rPr>
+        <w:t xml:space="preserve">• WebSocket endpoints for live operational updates alongside REST for CRUD and batch-style operations.</w:t>
+      </w:r>
+    </w:p>
+    <w:p>
+      <w:pPr>
+        <w:spacing w:after="20"/>
+      </w:pPr>
+      <w:r>
+        <w:rPr>
+          <w:rFonts w:ascii="Times New Roman" w:cs="Times New Roman" w:eastAsia="Times New Roman" w:hAnsi="Times New Roman"/>
+          <w:sz w:val="22"/>
+          <w:szCs w:val="22"/>
+        </w:rPr>
+        <w:t xml:space="preserve">• Documentation for service behavior and integration points; supported operations and cross-team onboarding.</w:t>
       </w:r>
     </w:p>
     <w:p>
@@ -468,7 +611,7 @@
           <w:sz w:val="22"/>
           <w:szCs w:val="22"/>
         </w:rPr>
-        <w:t xml:space="preserve">• Kubernetes: containerized services, health checks, and auto-scaling; WebSocket endpoints for real-time updates.</w:t>
+        <w:t xml:space="preserve">• Quality: JUnit and Mockito for core services to stabilize refactors and production releases.</w:t>
       </w:r>
     </w:p>
     <w:p>
@@ -509,33 +652,72 @@
           <w:sz w:val="22"/>
           <w:szCs w:val="22"/>
         </w:rPr>
-        <w:t xml:space="preserve">• Backend: Java, Spring Boot, REST APIs for vehicle manufacturing and supply chain analytics; Oracle and PostgreSQL.</w:t>
-      </w:r>
-    </w:p>
-    <w:p>
-      <w:pPr>
-        <w:spacing w:after="20"/>
-      </w:pPr>
-      <w:r>
-        <w:rPr>
-          <w:rFonts w:ascii="Times New Roman" w:cs="Times New Roman" w:eastAsia="Times New Roman" w:hAnsi="Times New Roman"/>
-          <w:sz w:val="22"/>
-          <w:szCs w:val="22"/>
-        </w:rPr>
-        <w:t xml:space="preserve">• ETL and integration: production, dealer, and logistics data into analytics stores; batch and near-real-time processing.</w:t>
-      </w:r>
-    </w:p>
-    <w:p>
-      <w:pPr>
-        <w:spacing w:after="20"/>
-      </w:pPr>
-      <w:r>
-        <w:rPr>
-          <w:rFonts w:ascii="Times New Roman" w:cs="Times New Roman" w:eastAsia="Times New Roman" w:hAnsi="Times New Roman"/>
-          <w:sz w:val="22"/>
-          <w:szCs w:val="22"/>
-        </w:rPr>
-        <w:t xml:space="preserve">• SQL optimization for reporting and dashboards; query performance up 30%; faster loads for 100+ users.</w:t>
+        <w:t xml:space="preserve">• Backend: Java, Spring Boot, REST APIs for vehicle manufacturing and supply chain analytics; Oracle and PostgreSQL for operational and analytics data stores.</w:t>
+      </w:r>
+    </w:p>
+    <w:p>
+      <w:pPr>
+        <w:spacing w:after="20"/>
+      </w:pPr>
+      <w:r>
+        <w:rPr>
+          <w:rFonts w:ascii="Times New Roman" w:cs="Times New Roman" w:eastAsia="Times New Roman" w:hAnsi="Times New Roman"/>
+          <w:sz w:val="22"/>
+          <w:szCs w:val="22"/>
+        </w:rPr>
+        <w:t xml:space="preserve">• Designed ETL workflows integrating vehicle production, dealer management, and logistics sources; backend processing for batch and near-real-time ingestion.</w:t>
+      </w:r>
+    </w:p>
+    <w:p>
+      <w:pPr>
+        <w:spacing w:after="20"/>
+      </w:pPr>
+      <w:r>
+        <w:rPr>
+          <w:rFonts w:ascii="Times New Roman" w:cs="Times New Roman" w:eastAsia="Times New Roman" w:hAnsi="Times New Roman"/>
+          <w:sz w:val="22"/>
+          <w:szCs w:val="22"/>
+        </w:rPr>
+        <w:t xml:space="preserve">• Built integration services between operational systems and analytics/reporting consumers; validation logic in Java for inventory and distribution data.</w:t>
+      </w:r>
+    </w:p>
+    <w:p>
+      <w:pPr>
+        <w:spacing w:after="20"/>
+      </w:pPr>
+      <w:r>
+        <w:rPr>
+          <w:rFonts w:ascii="Times New Roman" w:cs="Times New Roman" w:eastAsia="Times New Roman" w:hAnsi="Times New Roman"/>
+          <w:sz w:val="22"/>
+          <w:szCs w:val="22"/>
+        </w:rPr>
+        <w:t xml:space="preserve">• SQL tuning for analytics and reporting workloads; indexing and query design; query performance up 30%; faster loads for 100+ dashboard users.</w:t>
+      </w:r>
+    </w:p>
+    <w:p>
+      <w:pPr>
+        <w:spacing w:after="20"/>
+      </w:pPr>
+      <w:r>
+        <w:rPr>
+          <w:rFonts w:ascii="Times New Roman" w:cs="Times New Roman" w:eastAsia="Times New Roman" w:hAnsi="Times New Roman"/>
+          <w:sz w:val="22"/>
+          <w:szCs w:val="22"/>
+        </w:rPr>
+        <w:t xml:space="preserve">• REST APIs as the contract layer for internal reporting and analytics consumers; consistent error handling and payload standards.</w:t>
+      </w:r>
+    </w:p>
+    <w:p>
+      <w:pPr>
+        <w:spacing w:after="20"/>
+      </w:pPr>
+      <w:r>
+        <w:rPr>
+          <w:rFonts w:ascii="Times New Roman" w:cs="Times New Roman" w:eastAsia="Times New Roman" w:hAnsi="Times New Roman"/>
+          <w:sz w:val="22"/>
+          <w:szCs w:val="22"/>
+        </w:rPr>
+        <w:t xml:space="preserve">• Partnered with analysts and QA in Agile squads: user stories, acceptance criteria, and incremental releases.</w:t>
       </w:r>
     </w:p>
     <w:p>
@@ -548,7 +730,7 @@
           <w:sz w:val="22"/>
           <w:szCs w:val="22"/>
         </w:rPr>
-        <w:t xml:space="preserve">• REST integration layer and validation for inventory and distribution data; Agile coordination with analysts and QA.</w:t>
+        <w:t xml:space="preserve">• Supported traceability from source systems through ETL to reporting outputs for supply-chain visibility.</w:t>
       </w:r>
     </w:p>
     <w:p>
@@ -589,20 +771,72 @@
           <w:sz w:val="22"/>
           <w:szCs w:val="22"/>
         </w:rPr>
-        <w:t xml:space="preserve">• Backend: Spring Boot and Node.js for production monitoring; REST APIs for ERP integration (Oracle, PostgreSQL).</w:t>
-      </w:r>
-    </w:p>
-    <w:p>
-      <w:pPr>
-        <w:spacing w:after="20"/>
-      </w:pPr>
-      <w:r>
-        <w:rPr>
-          <w:rFonts w:ascii="Times New Roman" w:cs="Times New Roman" w:eastAsia="Times New Roman" w:hAnsi="Times New Roman"/>
-          <w:sz w:val="22"/>
-          <w:szCs w:val="22"/>
-        </w:rPr>
-        <w:t xml:space="preserve">• Frontend: AngularJS, React, and Bootstrap dashboards for inventory, lab, and production metrics; manual data entry down 70%.</w:t>
+        <w:t xml:space="preserve">• Backend: Spring Boot and Node.js services for production monitoring; REST APIs for ERP integration and data exchange with Oracle and PostgreSQL.</w:t>
+      </w:r>
+    </w:p>
+    <w:p>
+      <w:pPr>
+        <w:spacing w:after="20"/>
+      </w:pPr>
+      <w:r>
+        <w:rPr>
+          <w:rFonts w:ascii="Times New Roman" w:cs="Times New Roman" w:eastAsia="Times New Roman" w:hAnsi="Times New Roman"/>
+          <w:sz w:val="22"/>
+          <w:szCs w:val="22"/>
+        </w:rPr>
+        <w:t xml:space="preserve">• Frontend: AngularJS, React, and Bootstrap for inventory, laboratory, and production dashboards; manual data entry reduced by 70% via automated workflows.</w:t>
+      </w:r>
+    </w:p>
+    <w:p>
+      <w:pPr>
+        <w:spacing w:after="20"/>
+      </w:pPr>
+      <w:r>
+        <w:rPr>
+          <w:rFonts w:ascii="Times New Roman" w:cs="Times New Roman" w:eastAsia="Times New Roman" w:hAnsi="Times New Roman"/>
+          <w:sz w:val="22"/>
+          <w:szCs w:val="22"/>
+        </w:rPr>
+        <w:t xml:space="preserve">• ETL pipelines consolidating laboratory, quality control, and inventory data from multiple sources into reporting-ready models.</w:t>
+      </w:r>
+    </w:p>
+    <w:p>
+      <w:pPr>
+        <w:spacing w:after="20"/>
+      </w:pPr>
+      <w:r>
+        <w:rPr>
+          <w:rFonts w:ascii="Times New Roman" w:cs="Times New Roman" w:eastAsia="Times New Roman" w:hAnsi="Times New Roman"/>
+          <w:sz w:val="22"/>
+          <w:szCs w:val="22"/>
+        </w:rPr>
+        <w:t xml:space="preserve">• Data validation and SQL-based compliance reports aligned to pharmaceutical operational and audit expectations.</w:t>
+      </w:r>
+    </w:p>
+    <w:p>
+      <w:pPr>
+        <w:spacing w:after="20"/>
+      </w:pPr>
+      <w:r>
+        <w:rPr>
+          <w:rFonts w:ascii="Times New Roman" w:cs="Times New Roman" w:eastAsia="Times New Roman" w:hAnsi="Times New Roman"/>
+          <w:sz w:val="22"/>
+          <w:szCs w:val="22"/>
+        </w:rPr>
+        <w:t xml:space="preserve">• CI/CD: Jenkins and Maven with JUnit for automated builds and regression checks prior to releases.</w:t>
+      </w:r>
+    </w:p>
+    <w:p>
+      <w:pPr>
+        <w:spacing w:after="20"/>
+      </w:pPr>
+      <w:r>
+        <w:rPr>
+          <w:rFonts w:ascii="Times New Roman" w:cs="Times New Roman" w:eastAsia="Times New Roman" w:hAnsi="Times New Roman"/>
+          <w:sz w:val="22"/>
+          <w:szCs w:val="22"/>
+        </w:rPr>
+        <w:t xml:space="preserve">• Collaborated with operations and quality teams to refine reporting requirements and shorten feedback cycles on defects.</w:t>
       </w:r>
     </w:p>
     <w:p>
@@ -615,7 +849,7 @@
           <w:sz w:val="22"/>
           <w:szCs w:val="22"/>
         </w:rPr>
-        <w:t xml:space="preserve">• ETL for lab, QC, and inventory consolidation; SQL reporting for compliance; Jenkins, JUnit, and Maven in CI/CD.</w:t>
+        <w:t xml:space="preserve">• Audit-friendly reporting patterns and controlled data handoffs suitable for regulated manufacturing data.</w:t>
       </w:r>
     </w:p>
     <w:p>

</xml_diff>

<commit_message>
C2C resume: align header, skills, certs, and education with full-time resume.
Made-with: Cursor
</commit_message>
<xml_diff>
--- a/public/resume-c2c.docx
+++ b/public/resume-c2c.docx
@@ -13,7 +13,7 @@
           <w:sz w:val="22"/>
           <w:szCs w:val="22"/>
         </w:rPr>
-        <w:t xml:space="preserve"/>
+        <w:t xml:space="preserve">456-961-7695</w:t>
       </w:r>
     </w:p>
     <w:p>
@@ -57,7 +57,7 @@
           <w:sz w:val="22"/>
           <w:szCs w:val="22"/>
         </w:rPr>
-        <w:t xml:space="preserve">Tampa, FL, USA  •  gsg1499@gmail.com  •  linkedin.com/in/ganeshg7  •  github.com/sivaganesh1407</w:t>
+        <w:t xml:space="preserve">gsg1499@gmail.com  •  linkedin.com/in/ganeshg7  •  github.com/sivaganesh1407</w:t>
       </w:r>
     </w:p>
     <w:p>
@@ -119,7 +119,7 @@
           <w:sz w:val="22"/>
           <w:szCs w:val="22"/>
         </w:rPr>
-        <w:t xml:space="preserve">Backend: Java, Spring Boot, microservices, REST APIs, Spring Security (OAuth2, JWT, RBAC), Hibernate/JPA | Frontend: React, Angular, HTML5, CSS3, JavaScript, Bootstrap | Cloud &amp; DevOps: AWS (EC2, S3, RDS, Lambda, ECS, ECR), Docker, Kubernetes, Jenkins, Bitbucket, CI/CD, DevSecOps, Terraform, Ansible, Maven, Git | Event-driven architecture &amp; messaging: Kafka, RabbitMQ, Redis | Databases: Oracle, MySQL, PostgreSQL, MongoDB</w:t>
+        <w:t xml:space="preserve">Backend: Java, Spring Boot, microservices, REST APIs, Spring Security (OAuth2, JWT, RBAC), Hibernate/JPA | Frontend: React, Angular, HTML5, CSS3, JavaScript | Cloud &amp; DevOps: AWS (EC2, S3, RDS, Lambda, ECS), Docker, Kubernetes, Jenkins, Bitbucket, CI/CD, DevSecOps, Terraform, infrastructure as code | Event-driven architecture &amp; messaging: Kafka, RabbitMQ, Redis | Databases: Oracle, MySQL, PostgreSQL, MongoDB</w:t>
       </w:r>
     </w:p>
     <w:p>
@@ -132,7 +132,7 @@
           <w:sz w:val="22"/>
           <w:szCs w:val="22"/>
         </w:rPr>
-        <w:t xml:space="preserve">Quality &amp; observability: JUnit, Mockito, Selenium, Postman, Prometheus, Grafana, JIRA, Swagger</w:t>
+        <w:t xml:space="preserve">Quality &amp; observability: JUnit, Mockito, Prometheus, Grafana</w:t>
       </w:r>
     </w:p>
     <w:p>
@@ -796,7 +796,7 @@
           <w:sz w:val="22"/>
           <w:szCs w:val="22"/>
         </w:rPr>
-        <w:t xml:space="preserve">HashiCorp Certified: Terraform Associate (003)</w:t>
+        <w:t xml:space="preserve">HashiCorp Certified: Terraform Associate</w:t>
       </w:r>
       <w:r>
         <w:rPr>
@@ -858,7 +858,7 @@
           <w:sz w:val="22"/>
           <w:szCs w:val="22"/>
         </w:rPr>
-        <w:t xml:space="preserve">Grade: 3.45/5. Coursework: Information Systems Management, IT Infrastructure, Database Systems, Cloud Computing, Cybersecurity Fundamentals.</w:t>
+        <w:t xml:space="preserve">Grade: 3.45/5. Coursework: Information Systems Management, Database Systems, Cloud Computing.</w:t>
       </w:r>
     </w:p>
     <w:p>
@@ -894,7 +894,7 @@
           <w:sz w:val="22"/>
           <w:szCs w:val="22"/>
         </w:rPr>
-        <w:t xml:space="preserve">Grade: 7.2/10. Coursework: Communication Systems, Embedded Systems, Microprocessors, Digital Electronics, Computer Engineering. Active volunteer, National Service Scheme (NSS).</w:t>
+        <w:t xml:space="preserve">Grade: 7.2/10. Coursework: Communication Systems, Embedded Systems, Computer Engineering.</w:t>
       </w:r>
     </w:p>
     <w:p>

</xml_diff>